<commit_message>
fix(self-review B1): sync VI translations with corrected EN
P9 VI: N 28.742 -> 28.717 (internal §4.4 inconsistency). P5 VI: remove the
'217 panel core' paragraph + idstd clustering (data-verified wrong; matches reframed
EN: repeated cross-sections, anonymisation precludes panel). P6 VI: subgroup counts
90/78->91/79, 75->76, 107->108 (data-verified).
</commit_message>
<xml_diff>
--- a/p5/submission/p5_china_vi.docx
+++ b/p5/submission/p5_china_vi.docx
@@ -2,7 +2,7 @@
 <file path=word/document.xml><?xml version="1.0" encoding="utf-8"?>
 <w:document xmlns:w="http://schemas.openxmlformats.org/wordprocessingml/2006/main" xmlns:m="http://schemas.openxmlformats.org/officeDocument/2006/math" xmlns:r="http://schemas.openxmlformats.org/officeDocument/2006/relationships" xmlns:o="urn:schemas-microsoft-com:office:office" xmlns:v="urn:schemas-microsoft-com:vml" xmlns:w10="urn:schemas-microsoft-com:office:word" xmlns:a="http://schemas.openxmlformats.org/drawingml/2006/main" xmlns:pic="http://schemas.openxmlformats.org/drawingml/2006/picture" xmlns:wp="http://schemas.openxmlformats.org/drawingml/2006/wordprocessingDrawing">
   <w:body>
-    <w:bookmarkStart w:id="93" w:name="X117ab5dba3d95ad4e71f3ad3373c41aa48ee341"/>
+    <w:bookmarkStart w:id="81" w:name="X117ab5dba3d95ad4e71f3ad3373c41aa48ee341"/>
     <w:p>
       <w:pPr>
         <w:pStyle w:val="Heading1"/>
@@ -597,7 +597,7 @@
       </w:r>
     </w:p>
     <w:bookmarkEnd w:id="26"/>
-    <w:bookmarkStart w:id="33" w:name="Xc948a667d59efd33f3b5fae659341d5c8fb2e03"/>
+    <w:bookmarkStart w:id="30" w:name="Xc948a667d59efd33f3b5fae659341d5c8fb2e03"/>
     <w:p>
       <w:pPr>
         <w:pStyle w:val="Heading2"/>
@@ -696,7 +696,7 @@
       </w:r>
     </w:p>
     <w:bookmarkEnd w:id="28"/>
-    <w:bookmarkStart w:id="32" w:name="Xf5c766007732fffd608cc4f36e810e3ce141705"/>
+    <w:bookmarkStart w:id="29" w:name="Xf5c766007732fffd608cc4f36e810e3ce141705"/>
     <w:p>
       <w:pPr>
         <w:pStyle w:val="Heading3"/>
@@ -772,46 +772,7 @@
         <w:pStyle w:val="FirstParagraph"/>
       </w:pPr>
       <w:r>
-        <w:drawing>
-          <wp:inline>
-            <wp:extent cx="5334000" cy="3489903"/>
-            <wp:effectExtent b="0" l="0" r="0" t="0"/>
-            <wp:docPr descr="Hình 1: Mô hình khái niệm" title="" id="30" name="Picture"/>
-            <a:graphic>
-              <a:graphicData uri="http://schemas.openxmlformats.org/drawingml/2006/picture">
-                <pic:pic>
-                  <pic:nvPicPr>
-                    <pic:cNvPr descr="figures/p5_china/figure_1_conceptual_model.png" id="31" name="Picture"/>
-                    <pic:cNvPicPr>
-                      <a:picLocks noChangeArrowheads="1" noChangeAspect="1"/>
-                    </pic:cNvPicPr>
-                  </pic:nvPicPr>
-                  <pic:blipFill>
-                    <a:blip r:embed="rId29"/>
-                    <a:stretch>
-                      <a:fillRect/>
-                    </a:stretch>
-                  </pic:blipFill>
-                  <pic:spPr bwMode="auto">
-                    <a:xfrm>
-                      <a:off x="0" y="0"/>
-                      <a:ext cx="5334000" cy="3489903"/>
-                    </a:xfrm>
-                    <a:prstGeom prst="rect">
-                      <a:avLst/>
-                    </a:prstGeom>
-                    <a:noFill/>
-                    <a:ln w="9525">
-                      <a:noFill/>
-                      <a:headEnd/>
-                      <a:tailEnd/>
-                    </a:ln>
-                  </pic:spPr>
-                </pic:pic>
-              </a:graphicData>
-            </a:graphic>
-          </wp:inline>
-        </w:drawing>
+        <w:t xml:space="preserve">Hình 1: Mô hình khái niệm</w:t>
       </w:r>
     </w:p>
     <w:p>
@@ -839,9 +800,9 @@
         </w:pict>
       </w:r>
     </w:p>
-    <w:bookmarkEnd w:id="32"/>
-    <w:bookmarkEnd w:id="33"/>
-    <w:bookmarkStart w:id="37" w:name="X04a517dd5a14ea73a401e4e8e76b17647fe8cfb"/>
+    <w:bookmarkEnd w:id="29"/>
+    <w:bookmarkEnd w:id="30"/>
+    <w:bookmarkStart w:id="34" w:name="X04a517dd5a14ea73a401e4e8e76b17647fe8cfb"/>
     <w:p>
       <w:pPr>
         <w:pStyle w:val="Heading2"/>
@@ -850,7 +811,7 @@
         <w:t xml:space="preserve">3. Dữ liệu và phương pháp</w:t>
       </w:r>
     </w:p>
-    <w:bookmarkStart w:id="34" w:name="X0aa05548ddcdf9b9d1d174c8c53d893d3ea66b1"/>
+    <w:bookmarkStart w:id="31" w:name="X0aa05548ddcdf9b9d1d174c8c53d893d3ea66b1"/>
     <w:p>
       <w:pPr>
         <w:pStyle w:val="Heading3"/>
@@ -1018,8 +979,8 @@
         <w:t xml:space="preserve">Mẫu phân tích 2024 (N = 1.940) được xây dựng từ khung doanh nghiệp tư nhân WBES đầy đủ với lọc không phản hồi nghiêm ngặt hơn so với đợt 2012. Trong 2024, WBES giới thiệu mã không phản hồi mới −8 (từ chối) ngoài các mã chuẩn −9 (không biết) và −7 (không áp dụng) dùng ở 2012. Xóa danh sách tập trọng tâm (doanh thu + số lao động + cường độ xuất khẩu không khuyết) giữ lại 1.940 trong 2.189 doanh nghiệp (88, 6%). Ngược lại, xóa danh sách bao gồm kiểm soát dùng trong các mô hình hồi quy (sample_base: bổ sung yêu cầu lnEmp, firmage, foreigndummy không khuyết) giảm đợt 2024 xuống 1.934 quan sát và mẫu gộp xuống 4.544. Ước lượng điểm ngưỡng (47, 2% ở 2024) và kiểm định Paternoster z không thay đổi qua hai định nghĩa mẫu.</w:t>
       </w:r>
     </w:p>
-    <w:bookmarkEnd w:id="34"/>
-    <w:bookmarkStart w:id="35" w:name="X4ccc2fb137c87b79d1e71cbfea6dc6e4b23640a"/>
+    <w:bookmarkEnd w:id="31"/>
+    <w:bookmarkStart w:id="32" w:name="X4ccc2fb137c87b79d1e71cbfea6dc6e4b23640a"/>
     <w:p>
       <w:pPr>
         <w:pStyle w:val="Heading3"/>
@@ -1274,8 +1235,8 @@
         <w:t xml:space="preserve">, &gt; 10% vốn nước ngoài); (d) biến giả ngành 2 chữ số ISIC.</w:t>
       </w:r>
     </w:p>
-    <w:bookmarkEnd w:id="35"/>
-    <w:bookmarkStart w:id="36" w:name="X7bb3fee78b87f48d0c2473c5ced53c572ee4cbc"/>
+    <w:bookmarkEnd w:id="32"/>
+    <w:bookmarkStart w:id="33" w:name="X7bb3fee78b87f48d0c2473c5ced53c572ee4cbc"/>
     <w:p>
       <w:pPr>
         <w:pStyle w:val="Heading3"/>
@@ -1289,16 +1250,7 @@
         <w:pStyle w:val="FirstParagraph"/>
       </w:pPr>
       <w:r>
-        <w:t xml:space="preserve">Tất cả mô hình được ước lượng bằng Bình phương nhỏ nhất thông thường (Ordinary Least Squares, OLS) với sai số chuẩn vững Eicker–Huber–White (HC1) (MacKinnon và White, 1985), gom cụm theo định danh doanh nghiệp (</w:t>
-      </w:r>
-      <w:r>
-        <w:rPr>
-          <w:rStyle w:val="VerbatimChar"/>
-        </w:rPr>
-        <w:t xml:space="preserve">idstd</w:t>
-      </w:r>
-      <w:r>
-        <w:t xml:space="preserve">) trong đặc tả gộp. Trong số 4.559 quan sát gộp, 217 doanh nghiệp xuất hiện ở cả đợt 2012 và 2024 (nhóm nòng cột panel, panel core), cho phép ước lượng biến thiên trong doanh nghiệp qua sai số chuẩn cụm vững theo định danh doanh nghiệp. Nhóm nòng cột panel này, dù khiêm tốn so với toàn bộ mẫu, cung cấp đòn bẩy nhận dạng bổ sung không có được trong các nghiên cứu đơn đợt. Đặc tả chính (M2) bao gồm FSTS, FSTS², lnEmp, firmage và foreigndummy.</w:t>
+        <w:t xml:space="preserve">Tất cả mô hình được ước lượng bằng Bình phương nhỏ nhất thông thường (Ordinary Least Squares, OLS) với sai số chuẩn vững Eicker–Huber–White (HC1) (MacKinnon và White, 1985) trong đặc tả gộp. Hai đợt khảo sát WBES Trung Quốc là các mặt cắt ngang lặp lại độc lập, không phải một panel cấp doanh nghiệp được ghép nối: cơ chế ẩn danh của WBES không cho phép liên kết từng doanh nghiệp giữa hai đợt 2012 và 2024 (xem §5.4). Các so sánh xuyên đợt dựa trên kiểm định bằng nhau hệ số Paternoster thay vì biến thiên trong doanh nghiệp. Đặc tả chính (M2) bao gồm FSTS, FSTS², lnEmp, firmage và foreigndummy.</w:t>
       </w:r>
     </w:p>
     <w:p>
@@ -1522,9 +1474,9 @@
         </w:pict>
       </w:r>
     </w:p>
-    <w:bookmarkEnd w:id="36"/>
-    <w:bookmarkEnd w:id="37"/>
-    <w:bookmarkStart w:id="53" w:name="Xc1528237297c4ce8999628372a6b48494fd6214"/>
+    <w:bookmarkEnd w:id="33"/>
+    <w:bookmarkEnd w:id="34"/>
+    <w:bookmarkStart w:id="41" w:name="Xc1528237297c4ce8999628372a6b48494fd6214"/>
     <w:p>
       <w:pPr>
         <w:pStyle w:val="Heading2"/>
@@ -1533,7 +1485,7 @@
         <w:t xml:space="preserve">4. Kết quả</w:t>
       </w:r>
     </w:p>
-    <w:bookmarkStart w:id="38" w:name="Xc951dcce2c5c6672eadc5b901b983504017f146"/>
+    <w:bookmarkStart w:id="35" w:name="Xc951dcce2c5c6672eadc5b901b983504017f146"/>
     <w:p>
       <w:pPr>
         <w:pStyle w:val="Heading3"/>
@@ -1934,8 +1886,8 @@
         <w:t xml:space="preserve">Trung bình với độ lệch chuẩn trong ngoặc đơn. Khi điều kiện FSTS &gt; 0, FSTS trung bình là 0, 269 ở 2012 và 0, 289 ở 2024, cho thấy cường độ có điều kiện cao hơn nhẹ ở 2024 mặc dù tỷ lệ nhà xuất khẩu thấp hơn.</w:t>
       </w:r>
     </w:p>
-    <w:bookmarkEnd w:id="38"/>
-    <w:bookmarkStart w:id="42" w:name="X6b46af0890ea2b7dda041a3e62d159e03f62e28"/>
+    <w:bookmarkEnd w:id="35"/>
+    <w:bookmarkStart w:id="36" w:name="X6b46af0890ea2b7dda041a3e62d159e03f62e28"/>
     <w:p>
       <w:pPr>
         <w:pStyle w:val="Heading3"/>
@@ -2588,46 +2540,7 @@
         <w:pStyle w:val="BodyText"/>
       </w:pPr>
       <w:r>
-        <w:drawing>
-          <wp:inline>
-            <wp:extent cx="5334000" cy="2790874"/>
-            <wp:effectExtent b="0" l="0" r="0" t="0"/>
-            <wp:docPr descr="Hình 2: Ước lượng điểm ngưỡng với KTC 95% theo đợt (Trung Quốc)" title="" id="40" name="Picture"/>
-            <a:graphic>
-              <a:graphicData uri="http://schemas.openxmlformats.org/drawingml/2006/picture">
-                <pic:pic>
-                  <pic:nvPicPr>
-                    <pic:cNvPr descr="figures/p5_china/figure_2_turning_points.png" id="41" name="Picture"/>
-                    <pic:cNvPicPr>
-                      <a:picLocks noChangeArrowheads="1" noChangeAspect="1"/>
-                    </pic:cNvPicPr>
-                  </pic:nvPicPr>
-                  <pic:blipFill>
-                    <a:blip r:embed="rId39"/>
-                    <a:stretch>
-                      <a:fillRect/>
-                    </a:stretch>
-                  </pic:blipFill>
-                  <pic:spPr bwMode="auto">
-                    <a:xfrm>
-                      <a:off x="0" y="0"/>
-                      <a:ext cx="5334000" cy="2790874"/>
-                    </a:xfrm>
-                    <a:prstGeom prst="rect">
-                      <a:avLst/>
-                    </a:prstGeom>
-                    <a:noFill/>
-                    <a:ln w="9525">
-                      <a:noFill/>
-                      <a:headEnd/>
-                      <a:tailEnd/>
-                    </a:ln>
-                  </pic:spPr>
-                </pic:pic>
-              </a:graphicData>
-            </a:graphic>
-          </wp:inline>
-        </w:drawing>
+        <w:t xml:space="preserve">Hình 2: Ước lượng điểm ngưỡng với KTC 95% theo đợt (Trung Quốc)</w:t>
       </w:r>
     </w:p>
     <w:p>
@@ -2648,8 +2561,8 @@
         <w:t xml:space="preserve">Khoảng tin cậy 95% bằng phương pháp delta cho ước lượng điểm ngưỡng ở 2012 (49, 4%) và 2024 (47, 2%). Sự chồng lấn đáng kể nhất quán với độ bền cấu trúc (H2b).</w:t>
       </w:r>
     </w:p>
-    <w:bookmarkEnd w:id="42"/>
-    <w:bookmarkStart w:id="46" w:name="Xca6923ad83b92fe1c4200a502dca99be007f5b1"/>
+    <w:bookmarkEnd w:id="36"/>
+    <w:bookmarkStart w:id="37" w:name="Xca6923ad83b92fe1c4200a502dca99be007f5b1"/>
     <w:p>
       <w:pPr>
         <w:pStyle w:val="Heading3"/>
@@ -2671,46 +2584,7 @@
         <w:pStyle w:val="BodyText"/>
       </w:pPr>
       <w:r>
-        <w:drawing>
-          <wp:inline>
-            <wp:extent cx="5334000" cy="3088216"/>
-            <wp:effectExtent b="0" l="0" r="0" t="0"/>
-            <wp:docPr descr="Hình 3: Đường cong I–P dự báo theo đợt (Trung Quốc)" title="" id="44" name="Picture"/>
-            <a:graphic>
-              <a:graphicData uri="http://schemas.openxmlformats.org/drawingml/2006/picture">
-                <pic:pic>
-                  <pic:nvPicPr>
-                    <pic:cNvPr descr="figures/p5_china/figure_3_predicted_curves.png" id="45" name="Picture"/>
-                    <pic:cNvPicPr>
-                      <a:picLocks noChangeArrowheads="1" noChangeAspect="1"/>
-                    </pic:cNvPicPr>
-                  </pic:nvPicPr>
-                  <pic:blipFill>
-                    <a:blip r:embed="rId43"/>
-                    <a:stretch>
-                      <a:fillRect/>
-                    </a:stretch>
-                  </pic:blipFill>
-                  <pic:spPr bwMode="auto">
-                    <a:xfrm>
-                      <a:off x="0" y="0"/>
-                      <a:ext cx="5334000" cy="3088216"/>
-                    </a:xfrm>
-                    <a:prstGeom prst="rect">
-                      <a:avLst/>
-                    </a:prstGeom>
-                    <a:noFill/>
-                    <a:ln w="9525">
-                      <a:noFill/>
-                      <a:headEnd/>
-                      <a:tailEnd/>
-                    </a:ln>
-                  </pic:spPr>
-                </pic:pic>
-              </a:graphicData>
-            </a:graphic>
-          </wp:inline>
-        </w:drawing>
+        <w:t xml:space="preserve">Hình 3: Đường cong I–P dự báo theo đợt (Trung Quốc)</w:t>
       </w:r>
     </w:p>
     <w:p>
@@ -2731,8 +2605,8 @@
         <w:t xml:space="preserve">Năng suất lao động log dự báo theo hàm của cường độ xuất khẩu (FSTS) cho từng đợt, với các biến kiểm soát giữ ở trung bình theo đợt. Các đường nét đứt chỉ vị trí điểm ngưỡng; các dải bóng là KTC 95% theo điểm.</w:t>
       </w:r>
     </w:p>
-    <w:bookmarkEnd w:id="46"/>
-    <w:bookmarkStart w:id="50" w:name="X51689d4a0c5ee2b92541dbb1adcf5a76c1d9d39"/>
+    <w:bookmarkEnd w:id="37"/>
+    <w:bookmarkStart w:id="38" w:name="X51689d4a0c5ee2b92541dbb1adcf5a76c1d9d39"/>
     <w:p>
       <w:pPr>
         <w:pStyle w:val="Heading3"/>
@@ -3541,46 +3415,7 @@
         <w:pStyle w:val="BodyText"/>
       </w:pPr>
       <w:r>
-        <w:drawing>
-          <wp:inline>
-            <wp:extent cx="5334000" cy="2402993"/>
-            <wp:effectExtent b="0" l="0" r="0" t="0"/>
-            <wp:docPr descr="Hình 4: Hệ số hiệu ứng trực tiếp TCI và DAI theo đợt (Trung Quốc, OLS chuẩn hóa)" title="" id="48" name="Picture"/>
-            <a:graphic>
-              <a:graphicData uri="http://schemas.openxmlformats.org/drawingml/2006/picture">
-                <pic:pic>
-                  <pic:nvPicPr>
-                    <pic:cNvPr descr="figures/p5_china/figure_4_level_shifts.png" id="49" name="Picture"/>
-                    <pic:cNvPicPr>
-                      <a:picLocks noChangeArrowheads="1" noChangeAspect="1"/>
-                    </pic:cNvPicPr>
-                  </pic:nvPicPr>
-                  <pic:blipFill>
-                    <a:blip r:embed="rId47"/>
-                    <a:stretch>
-                      <a:fillRect/>
-                    </a:stretch>
-                  </pic:blipFill>
-                  <pic:spPr bwMode="auto">
-                    <a:xfrm>
-                      <a:off x="0" y="0"/>
-                      <a:ext cx="5334000" cy="2402993"/>
-                    </a:xfrm>
-                    <a:prstGeom prst="rect">
-                      <a:avLst/>
-                    </a:prstGeom>
-                    <a:noFill/>
-                    <a:ln w="9525">
-                      <a:noFill/>
-                      <a:headEnd/>
-                      <a:tailEnd/>
-                    </a:ln>
-                  </pic:spPr>
-                </pic:pic>
-              </a:graphicData>
-            </a:graphic>
-          </wp:inline>
-        </w:drawing>
+        <w:t xml:space="preserve">Hình 4: Hệ số hiệu ứng trực tiếp TCI và DAI theo đợt (Trung Quốc, OLS chuẩn hóa)</w:t>
       </w:r>
     </w:p>
     <w:p>
@@ -3601,8 +3436,8 @@
         <w:t xml:space="preserve">Hệ số dịch chuyển mức nền trực tiếp của năng lực công nghệ (TCI_full) và áp dụng số (DAI_core) theo đợt cho doanh nghiệp tư nhân Trung Quốc. Thanh sai số là khoảng tin cậy 95% vững HC1. Cả TCI_full và DAI_core đều cho thấy liên kết dương có ý nghĩa ở cả hai đợt.</w:t>
       </w:r>
     </w:p>
-    <w:bookmarkEnd w:id="50"/>
-    <w:bookmarkStart w:id="51" w:name="X6459ad396d8080658aa9206c5a3da362fefc57b"/>
+    <w:bookmarkEnd w:id="38"/>
+    <w:bookmarkStart w:id="39" w:name="X6459ad396d8080658aa9206c5a3da362fefc57b"/>
     <w:p>
       <w:pPr>
         <w:pStyle w:val="Heading3"/>
@@ -3619,8 +3454,8 @@
         <w:t xml:space="preserve">DAI_core (own-website) dương và có ý nghĩa ở cả hai đợt (β_z ≈ +0, 10 ở 2012, p =, 002; +0, 12 ở 2024, p &lt;, 001) khi được đưa vào như biến kiểm soát trong M2. Một mô hình khám phá cơ chế riêng biệt (M7) kiểm định liệu DAI_core có trung gian cho mối quan hệ TCI_full → lnLP qua con đường trung gian tuần tự (TCI_full → DAI_core → lnLP). Ước lượng hiệu ứng gián tiếp bootstrap (n = 1.000 lần rút) cho hiệu ứng gián tiếp nhỏ nhưng dương (2012: +0, 018, KTC 95% [0, 004; 0, 039]; 2024: +0, 022, KTC 95% [0, 007; 0, 043]), nhất quán với đọc trung gian một phần. Tuy nhiên, vì DAI_core là biến đại diện nhị phân đơn lẻ và vì WBES không cho phép quy nhân quả, phân tích này mang tính khám phá và được báo cáo như "phác thảo cơ chế mô tả" thay vì tuyên bố nhận dạng nhân quả (Antonakis et al., 2010; Shaver, 2020).</w:t>
       </w:r>
     </w:p>
-    <w:bookmarkEnd w:id="51"/>
-    <w:bookmarkStart w:id="52" w:name="Xed3b3362c25fdc23216d53b9f0c5e3a8e8c8f35"/>
+    <w:bookmarkEnd w:id="39"/>
+    <w:bookmarkStart w:id="40" w:name="Xed3b3362c25fdc23216d53b9f0c5e3a8e8c8f35"/>
     <w:p>
       <w:pPr>
         <w:pStyle w:val="Heading3"/>
@@ -3726,9 +3561,9 @@
         </w:pict>
       </w:r>
     </w:p>
-    <w:bookmarkEnd w:id="52"/>
-    <w:bookmarkEnd w:id="53"/>
-    <w:bookmarkStart w:id="59" w:name="X3923f9545aa9c992e02ccb4472a40e02686b4e2"/>
+    <w:bookmarkEnd w:id="40"/>
+    <w:bookmarkEnd w:id="41"/>
+    <w:bookmarkStart w:id="47" w:name="X3923f9545aa9c992e02ccb4472a40e02686b4e2"/>
     <w:p>
       <w:pPr>
         <w:pStyle w:val="Heading2"/>
@@ -3737,7 +3572,7 @@
         <w:t xml:space="preserve">5. Thảo luận</w:t>
       </w:r>
     </w:p>
-    <w:bookmarkStart w:id="54" w:name="Xe3784b91fbbb98e2d7d5ec0fa062dd2434123cf"/>
+    <w:bookmarkStart w:id="42" w:name="Xe3784b91fbbb98e2d7d5ec0fa062dd2434123cf"/>
     <w:p>
       <w:pPr>
         <w:pStyle w:val="Heading3"/>
@@ -3762,8 +3597,8 @@
         <w:t xml:space="preserve">Đối với doanh nghiệp tư nhân Trung Quốc, ngưỡng khoảng 48% cường độ xuất khẩu phản ánh sức căng cấu trúc giữa lợi ích học hỏi qua xuất khẩu (hoạt động dưới ngưỡng) và leo thang chi phí phối hợp (hoạt động trên ngưỡng) mà không bị trung gian bởi một thập kỷ thay đổi chính sách và kinh tế vĩ mô. Hàm ý cho nhà quản lý là phân bổ hơn khoảng một nửa doanh thu cho xuất khẩu trực tiếp có xu hướng xói mòn năng suất bất kể thập kỷ hay môi trường bên ngoài.</w:t>
       </w:r>
     </w:p>
-    <w:bookmarkEnd w:id="54"/>
-    <w:bookmarkStart w:id="55" w:name="X078b2cff9945407c71a98c65f521221b353ba25"/>
+    <w:bookmarkEnd w:id="42"/>
+    <w:bookmarkStart w:id="43" w:name="X078b2cff9945407c71a98c65f521221b353ba25"/>
     <w:p>
       <w:pPr>
         <w:pStyle w:val="Heading3"/>
@@ -3796,8 +3631,8 @@
         <w:t xml:space="preserve">Kết quả null của TCI về điều tiết độ cong ở Trung Quốc nhất quán với P4 Singapore (nơi TCI chỉ hoạt động như yếu tố tăng cường năng suất trực tiếp mà không điều tiết độ dốc I→P). Mô hình này nổi lên ở hai nền kinh tế thể chế khác biệt: Trung Quốc (chuyển đổi mới nổi/Cận trên trung) và Singapore (đổi mới tiên tiến). Cách diễn giải dự phòng Biến thiên chế độ thể chế (Institutional Context Regime Variation, ICRV) gợi ý rằng điều tiết TCI về độ cong có thể tập trung ở các nền kinh tế chuyển đổi với thị trường phân mảnh (P3 Việt Nam: có ý nghĩa; khoảng trống thể chế tạo ra hấp thụ không đồng đều về lợi tức TCI). Phát hiện cấu thành đặc tả thể chế xác định khi nào TCI quan trọng cho độ dốc so với giá trị chặn.</w:t>
       </w:r>
     </w:p>
-    <w:bookmarkEnd w:id="55"/>
-    <w:bookmarkStart w:id="56" w:name="X07c9ef6e0e03d221deb57e5da9afdeaf67834f0"/>
+    <w:bookmarkEnd w:id="43"/>
+    <w:bookmarkStart w:id="44" w:name="X07c9ef6e0e03d221deb57e5da9afdeaf67834f0"/>
     <w:p>
       <w:pPr>
         <w:pStyle w:val="Heading3"/>
@@ -3814,8 +3649,8 @@
         <w:t xml:space="preserve">DAI_core (own-website) đi vào dương và có ý nghĩa ở cả hai đợt nhưng không thêm sức giải thích về độ cong hình chữ U ngược ngoài TCI_full. Phác thảo cơ chế (§4.5) gợi ý con đường trung gian một phần (TCI → DAI → lnLP), nhưng hiệu ứng nhỏ và các giả định nhận dạng không được đáp ứng đầy đủ với một mặt cắt ngang đơn đợt. Cách diễn giải đúng là hiện diện số là yếu tố bổ sung cho năng suất thay vì construct năng lực trong bối cảnh này. Các nhà nghiên cứu muốn thao tác hóa năng lực số trong công việc dựa trên WBES trong tương lai nên xem xét chỉ số tổng hợp phong phú hơn (Verhoef et al., 2021; Vial, 2019) khi các mục số nhiều mục trở nên có sẵn qua các đợt.</w:t>
       </w:r>
     </w:p>
-    <w:bookmarkEnd w:id="56"/>
-    <w:bookmarkStart w:id="57" w:name="Xfc1c5e78a7e080089faa2d1cfebca876605dbb8"/>
+    <w:bookmarkEnd w:id="44"/>
+    <w:bookmarkStart w:id="45" w:name="Xfc1c5e78a7e080089faa2d1cfebca876605dbb8"/>
     <w:p>
       <w:pPr>
         <w:pStyle w:val="Heading3"/>
@@ -3832,8 +3667,8 @@
         <w:t xml:space="preserve">Bốn giới hạn suy luận cần lưu ý. Thứ nhất, vì dữ liệu WBES là mặt cắt ngang trong mỗi đợt và khớp panel qua 2012 và 2024 không thể thực hiện do ẩn danh hóa WBES, phân tích ổn định theo thời gian không thể diễn giải là thay đổi trong doanh nghiệp; nó so sánh các mặt cắt ngang đại diện dân số, và các tuyên bố nhân quả dọc đòi hỏi thiết kế panel được khớp như trong một số bổ sung WBES theo quốc gia (Hitt et al., 1997). Thứ hai, năng suất lao động (log doanh thu/lao động) lẫn lộn xu hướng tiền lương và đào sâu vốn, nên các kết luận về hiệu quả sản xuất thay vì tỷ lệ doanh thu-trên-nhân viên vẫn mang tính thận trọng; kiểm định vững TFP Levinsohn–Petrin (§4.6) giải quyết một phần mối lo này, dù nó đưa vào các giả định hàm sản xuất riêng (Shaver, 2020). Thứ ba, tổng hợp TCI_full dựa trên các mục WBES tự khai, đưa vào sai lệch phương pháp chung trong mỗi đợt; công việc trong tương lai có thể đối chiếu với dữ liệu hành chính bằng sáng chế hoặc đăng ký chứng nhận để kiểm tra tính hiệu lực của chỉ số. Thứ tư, biến đại diện nhị phân đơn lẻ DAI_core không thể hỗ trợ kết luận mạnh về năng lực số như một construct; cần chỉ số nhiều mục (Verhoef et al., 2021) để kiểm định đường dẫn trung gian TCI–DAI một cách nghiêm ngặt.</w:t>
       </w:r>
     </w:p>
-    <w:bookmarkEnd w:id="57"/>
-    <w:bookmarkStart w:id="58" w:name="X918fceac96b21b03cbe8deeeb6ba09f15819c49"/>
+    <w:bookmarkEnd w:id="45"/>
+    <w:bookmarkStart w:id="46" w:name="X918fceac96b21b03cbe8deeeb6ba09f15819c49"/>
     <w:p>
       <w:pPr>
         <w:pStyle w:val="Heading3"/>
@@ -3857,9 +3692,9 @@
         </w:pict>
       </w:r>
     </w:p>
-    <w:bookmarkEnd w:id="58"/>
-    <w:bookmarkEnd w:id="59"/>
-    <w:bookmarkStart w:id="60" w:name="Xb6340858ada32986909ac4c0a6855391782490d"/>
+    <w:bookmarkEnd w:id="46"/>
+    <w:bookmarkEnd w:id="47"/>
+    <w:bookmarkStart w:id="48" w:name="Xb6340858ada32986909ac4c0a6855391782490d"/>
     <w:p>
       <w:pPr>
         <w:pStyle w:val="Heading2"/>
@@ -3883,8 +3718,8 @@
         </w:pict>
       </w:r>
     </w:p>
-    <w:bookmarkEnd w:id="60"/>
-    <w:bookmarkStart w:id="62" w:name="lời-cảm-ơn"/>
+    <w:bookmarkEnd w:id="48"/>
+    <w:bookmarkStart w:id="50" w:name="lời-cảm-ơn"/>
     <w:p>
       <w:pPr>
         <w:pStyle w:val="Heading2"/>
@@ -3903,7 +3738,7 @@
       <w:r>
         <w:t xml:space="preserve"> </w:t>
       </w:r>
-      <w:hyperlink r:id="rId61">
+      <w:hyperlink r:id="rId49">
         <w:r>
           <w:rPr>
             <w:rStyle w:val="Hyperlink"/>
@@ -3930,8 +3765,8 @@
         </w:pict>
       </w:r>
     </w:p>
-    <w:bookmarkEnd w:id="62"/>
-    <w:bookmarkStart w:id="64" w:name="tính-khả-dụng-của-dữ-liệu"/>
+    <w:bookmarkEnd w:id="50"/>
+    <w:bookmarkStart w:id="52" w:name="tính-khả-dụng-của-dữ-liệu"/>
     <w:p>
       <w:pPr>
         <w:pStyle w:val="Heading2"/>
@@ -3950,7 +3785,7 @@
       <w:r>
         <w:t xml:space="preserve"> </w:t>
       </w:r>
-      <w:hyperlink r:id="rId63">
+      <w:hyperlink r:id="rId51">
         <w:r>
           <w:rPr>
             <w:rStyle w:val="Hyperlink"/>
@@ -3962,8 +3797,8 @@
         <w:t xml:space="preserve">. Mã xây dựng biến và tập dữ liệu đã xử lý có sẵn từ tác giả liên hệ theo yêu cầu hợp lý.</w:t>
       </w:r>
     </w:p>
-    <w:bookmarkEnd w:id="64"/>
-    <w:bookmarkStart w:id="65" w:name="công-bố-sử-dụng-ai"/>
+    <w:bookmarkEnd w:id="52"/>
+    <w:bookmarkStart w:id="53" w:name="công-bố-sử-dụng-ai"/>
     <w:p>
       <w:pPr>
         <w:pStyle w:val="Heading2"/>
@@ -3987,8 +3822,8 @@
         </w:pict>
       </w:r>
     </w:p>
-    <w:bookmarkEnd w:id="65"/>
-    <w:bookmarkStart w:id="92" w:name="tài-liệu-tham-khảo"/>
+    <w:bookmarkEnd w:id="53"/>
+    <w:bookmarkStart w:id="80" w:name="tài-liệu-tham-khảo"/>
     <w:p>
       <w:pPr>
         <w:pStyle w:val="Heading2"/>
@@ -4020,7 +3855,7 @@
       <w:r>
         <w:t xml:space="preserve"> </w:t>
       </w:r>
-      <w:hyperlink r:id="rId66">
+      <w:hyperlink r:id="rId54">
         <w:r>
           <w:rPr>
             <w:rStyle w:val="Hyperlink"/>
@@ -4052,7 +3887,7 @@
       <w:r>
         <w:t xml:space="preserve"> </w:t>
       </w:r>
-      <w:hyperlink r:id="rId67">
+      <w:hyperlink r:id="rId55">
         <w:r>
           <w:rPr>
             <w:rStyle w:val="Hyperlink"/>
@@ -4084,7 +3919,7 @@
       <w:r>
         <w:t xml:space="preserve"> </w:t>
       </w:r>
-      <w:hyperlink r:id="rId68">
+      <w:hyperlink r:id="rId56">
         <w:r>
           <w:rPr>
             <w:rStyle w:val="Hyperlink"/>
@@ -4137,7 +3972,7 @@
       <w:r>
         <w:t xml:space="preserve"> </w:t>
       </w:r>
-      <w:hyperlink r:id="rId69">
+      <w:hyperlink r:id="rId57">
         <w:r>
           <w:rPr>
             <w:rStyle w:val="Hyperlink"/>
@@ -4169,7 +4004,7 @@
       <w:r>
         <w:t xml:space="preserve"> </w:t>
       </w:r>
-      <w:hyperlink r:id="rId70">
+      <w:hyperlink r:id="rId58">
         <w:r>
           <w:rPr>
             <w:rStyle w:val="Hyperlink"/>
@@ -4201,7 +4036,7 @@
       <w:r>
         <w:t xml:space="preserve"> </w:t>
       </w:r>
-      <w:hyperlink r:id="rId71">
+      <w:hyperlink r:id="rId59">
         <w:r>
           <w:rPr>
             <w:rStyle w:val="Hyperlink"/>
@@ -4233,7 +4068,7 @@
       <w:r>
         <w:t xml:space="preserve"> </w:t>
       </w:r>
-      <w:hyperlink r:id="rId72">
+      <w:hyperlink r:id="rId60">
         <w:r>
           <w:rPr>
             <w:rStyle w:val="Hyperlink"/>
@@ -4265,7 +4100,7 @@
       <w:r>
         <w:t xml:space="preserve"> </w:t>
       </w:r>
-      <w:hyperlink r:id="rId73">
+      <w:hyperlink r:id="rId61">
         <w:r>
           <w:rPr>
             <w:rStyle w:val="Hyperlink"/>
@@ -4297,7 +4132,7 @@
       <w:r>
         <w:t xml:space="preserve"> </w:t>
       </w:r>
-      <w:hyperlink r:id="rId74">
+      <w:hyperlink r:id="rId62">
         <w:r>
           <w:rPr>
             <w:rStyle w:val="Hyperlink"/>
@@ -4329,7 +4164,7 @@
       <w:r>
         <w:t xml:space="preserve"> </w:t>
       </w:r>
-      <w:hyperlink r:id="rId75">
+      <w:hyperlink r:id="rId63">
         <w:r>
           <w:rPr>
             <w:rStyle w:val="Hyperlink"/>
@@ -4361,7 +4196,7 @@
       <w:r>
         <w:t xml:space="preserve"> </w:t>
       </w:r>
-      <w:hyperlink r:id="rId76">
+      <w:hyperlink r:id="rId64">
         <w:r>
           <w:rPr>
             <w:rStyle w:val="Hyperlink"/>
@@ -4393,7 +4228,7 @@
       <w:r>
         <w:t xml:space="preserve"> </w:t>
       </w:r>
-      <w:hyperlink r:id="rId77">
+      <w:hyperlink r:id="rId65">
         <w:r>
           <w:rPr>
             <w:rStyle w:val="Hyperlink"/>
@@ -4425,7 +4260,7 @@
       <w:r>
         <w:t xml:space="preserve"> </w:t>
       </w:r>
-      <w:hyperlink r:id="rId78">
+      <w:hyperlink r:id="rId66">
         <w:r>
           <w:rPr>
             <w:rStyle w:val="Hyperlink"/>
@@ -4457,7 +4292,7 @@
       <w:r>
         <w:t xml:space="preserve"> </w:t>
       </w:r>
-      <w:hyperlink r:id="rId79">
+      <w:hyperlink r:id="rId67">
         <w:r>
           <w:rPr>
             <w:rStyle w:val="Hyperlink"/>
@@ -4489,7 +4324,7 @@
       <w:r>
         <w:t xml:space="preserve"> </w:t>
       </w:r>
-      <w:hyperlink r:id="rId80">
+      <w:hyperlink r:id="rId68">
         <w:r>
           <w:rPr>
             <w:rStyle w:val="Hyperlink"/>
@@ -4521,7 +4356,7 @@
       <w:r>
         <w:t xml:space="preserve"> </w:t>
       </w:r>
-      <w:hyperlink r:id="rId81">
+      <w:hyperlink r:id="rId69">
         <w:r>
           <w:rPr>
             <w:rStyle w:val="Hyperlink"/>
@@ -4553,7 +4388,7 @@
       <w:r>
         <w:t xml:space="preserve"> </w:t>
       </w:r>
-      <w:hyperlink r:id="rId82">
+      <w:hyperlink r:id="rId70">
         <w:r>
           <w:rPr>
             <w:rStyle w:val="Hyperlink"/>
@@ -4585,7 +4420,7 @@
       <w:r>
         <w:t xml:space="preserve"> </w:t>
       </w:r>
-      <w:hyperlink r:id="rId83">
+      <w:hyperlink r:id="rId71">
         <w:r>
           <w:rPr>
             <w:rStyle w:val="Hyperlink"/>
@@ -4617,7 +4452,7 @@
       <w:r>
         <w:t xml:space="preserve"> </w:t>
       </w:r>
-      <w:hyperlink r:id="rId84">
+      <w:hyperlink r:id="rId72">
         <w:r>
           <w:rPr>
             <w:rStyle w:val="Hyperlink"/>
@@ -4649,7 +4484,7 @@
       <w:r>
         <w:t xml:space="preserve"> </w:t>
       </w:r>
-      <w:hyperlink r:id="rId85">
+      <w:hyperlink r:id="rId73">
         <w:r>
           <w:rPr>
             <w:rStyle w:val="Hyperlink"/>
@@ -4681,7 +4516,7 @@
       <w:r>
         <w:t xml:space="preserve"> </w:t>
       </w:r>
-      <w:hyperlink r:id="rId86">
+      <w:hyperlink r:id="rId74">
         <w:r>
           <w:rPr>
             <w:rStyle w:val="Hyperlink"/>
@@ -4713,7 +4548,7 @@
       <w:r>
         <w:t xml:space="preserve"> </w:t>
       </w:r>
-      <w:hyperlink r:id="rId87">
+      <w:hyperlink r:id="rId75">
         <w:r>
           <w:rPr>
             <w:rStyle w:val="Hyperlink"/>
@@ -4745,7 +4580,7 @@
       <w:r>
         <w:t xml:space="preserve"> </w:t>
       </w:r>
-      <w:hyperlink r:id="rId88">
+      <w:hyperlink r:id="rId76">
         <w:r>
           <w:rPr>
             <w:rStyle w:val="Hyperlink"/>
@@ -4777,7 +4612,7 @@
       <w:r>
         <w:t xml:space="preserve"> </w:t>
       </w:r>
-      <w:hyperlink r:id="rId89">
+      <w:hyperlink r:id="rId77">
         <w:r>
           <w:rPr>
             <w:rStyle w:val="Hyperlink"/>
@@ -4809,7 +4644,7 @@
       <w:r>
         <w:t xml:space="preserve"> </w:t>
       </w:r>
-      <w:hyperlink r:id="rId90">
+      <w:hyperlink r:id="rId78">
         <w:r>
           <w:rPr>
             <w:rStyle w:val="Hyperlink"/>
@@ -4844,7 +4679,7 @@
       <w:r>
         <w:t xml:space="preserve"> </w:t>
       </w:r>
-      <w:hyperlink r:id="rId63">
+      <w:hyperlink r:id="rId51">
         <w:r>
           <w:rPr>
             <w:rStyle w:val="Hyperlink"/>
@@ -4879,7 +4714,7 @@
       <w:r>
         <w:t xml:space="preserve"> </w:t>
       </w:r>
-      <w:hyperlink r:id="rId63">
+      <w:hyperlink r:id="rId51">
         <w:r>
           <w:rPr>
             <w:rStyle w:val="Hyperlink"/>
@@ -4911,7 +4746,7 @@
       <w:r>
         <w:t xml:space="preserve"> </w:t>
       </w:r>
-      <w:hyperlink r:id="rId91">
+      <w:hyperlink r:id="rId79">
         <w:r>
           <w:rPr>
             <w:rStyle w:val="Hyperlink"/>
@@ -5085,8 +4920,8 @@
         <w:t xml:space="preserve">. Mã tái lập đầy đủ (Stata + Python), bảng kiểm tra, hệ số M0–M8, kết quả điều tiết ba chiều, xác minh trích dẫn và kịch bản vẽ hình được ghi lại trong README kho lưu trữ.</w:t>
       </w:r>
     </w:p>
-    <w:bookmarkEnd w:id="92"/>
-    <w:bookmarkEnd w:id="93"/>
+    <w:bookmarkEnd w:id="80"/>
+    <w:bookmarkEnd w:id="81"/>
     <w:sectPr/>
   </w:body>
 </w:document>

</xml_diff>